<commit_message>
Proposal figures: real screenshots (Gbr 4/15 composites, 16/17 swap, new 18)
</commit_message>
<xml_diff>
--- a/proposal/HOBYD-Proposal-Final-Updated.docx
+++ b/proposal/HOBYD-Proposal-Final-Updated.docx
@@ -1011,7 +1011,7 @@
         </w:rPr>
         <w:drawing>
           <wp:inline distT="0" distB="0" distL="0" distR="0" wp14:anchorId="6D9DB818" wp14:editId="56AC67EE">
-            <wp:extent cx="4500000" cy="3033605"/>
+            <wp:extent cx="4500000" cy="1852198"/>
             <wp:effectExtent l="0" t="0" r="0" b="0"/>
             <wp:docPr id="6" name="Picture 6"/>
             <wp:cNvGraphicFramePr>
@@ -3273,7 +3273,7 @@
         <w:lastRenderedPageBreak/>
         <w:drawing>
           <wp:inline distT="0" distB="0" distL="0" distR="0" wp14:anchorId="3664706D" wp14:editId="4639C343">
-            <wp:extent cx="4680000" cy="2612093"/>
+            <wp:extent cx="4680000" cy="1780545"/>
             <wp:effectExtent l="0" t="0" r="0" b="0"/>
             <wp:docPr id="16" name="Picture 16"/>
             <wp:cNvGraphicFramePr>
@@ -3314,11 +3314,7 @@
         <w:jc w:val="center"/>
       </w:pPr>
       <w:r>
-        <w:rPr>
-          <w:i/>
-          <w:sz w:val="20"/>
-        </w:rPr>
-        <w:t>Gambar 15. Halaman utama (tampilan demo).</w:t>
+        <w:t>Gambar 15. Halaman utama (desktop dan mobile).</w:t>
       </w:r>
     </w:p>
     <w:p>
@@ -3332,7 +3328,7 @@
         </w:rPr>
         <w:drawing>
           <wp:inline distT="0" distB="0" distL="0" distR="0" wp14:anchorId="3104CDFD" wp14:editId="205F24ED">
-            <wp:extent cx="4680000" cy="2612093"/>
+            <wp:extent cx="4680000" cy="2392434"/>
             <wp:effectExtent l="0" t="0" r="0" b="0"/>
             <wp:docPr id="17" name="Picture 17"/>
             <wp:cNvGraphicFramePr>
@@ -3392,7 +3388,7 @@
         <w:lastRenderedPageBreak/>
         <w:drawing>
           <wp:inline distT="0" distB="0" distL="0" distR="0" wp14:anchorId="7D184C8B" wp14:editId="283D7665">
-            <wp:extent cx="2520000" cy="4515000"/>
+            <wp:extent cx="2520000" cy="1171971"/>
             <wp:effectExtent l="0" t="0" r="0" b="0"/>
             <wp:docPr id="18" name="Picture 18"/>
             <wp:cNvGraphicFramePr>
@@ -3438,6 +3434,53 @@
           <w:sz w:val="20"/>
         </w:rPr>
         <w:t>Gambar 17. Pembayaran demo (tampilan demo).</w:t>
+      </w:r>
+    </w:p>
+    <w:p>
+      <w:pPr>
+        <w:jc w:val="center"/>
+      </w:pPr>
+      <w:r>
+        <w:drawing>
+          <wp:inline xmlns:a="http://schemas.openxmlformats.org/drawingml/2006/main" xmlns:pic="http://schemas.openxmlformats.org/drawingml/2006/picture">
+            <wp:extent cx="2520000" cy="1296113"/>
+            <wp:docPr id="19" name="Picture 19"/>
+            <wp:cNvGraphicFramePr>
+              <a:graphicFrameLocks noChangeAspect="1"/>
+            </wp:cNvGraphicFramePr>
+            <a:graphic>
+              <a:graphicData uri="http://schemas.openxmlformats.org/drawingml/2006/picture">
+                <pic:pic>
+                  <pic:nvPicPr>
+                    <pic:cNvPr id="0" name="image.jpg"/>
+                    <pic:cNvPicPr/>
+                  </pic:nvPicPr>
+                  <pic:blipFill>
+                    <a:blip r:embed="rId26"/>
+                    <a:stretch>
+                      <a:fillRect/>
+                    </a:stretch>
+                  </pic:blipFill>
+                  <pic:spPr>
+                    <a:xfrm>
+                      <a:off x="0" y="0"/>
+                      <a:ext cx="2520000" cy="1296113"/>
+                    </a:xfrm>
+                    <a:prstGeom prst="rect"/>
+                  </pic:spPr>
+                </pic:pic>
+              </a:graphicData>
+            </a:graphic>
+          </wp:inline>
+        </w:drawing>
+      </w:r>
+    </w:p>
+    <w:p>
+      <w:pPr>
+        <w:jc w:val="center"/>
+      </w:pPr>
+      <w:r>
+        <w:t>Gambar 18. Tampilan penjual live.</w:t>
       </w:r>
     </w:p>
     <w:p>

</xml_diff>

<commit_message>
Proposal cover: HOBYD logo above title
</commit_message>
<xml_diff>
--- a/proposal/HOBYD-Proposal-Final-Updated.docx
+++ b/proposal/HOBYD-Proposal-Final-Updated.docx
@@ -3,6 +3,45 @@
 <w:document xmlns:wpc="http://schemas.microsoft.com/office/word/2010/wordprocessingCanvas" xmlns:cx="http://schemas.microsoft.com/office/drawing/2014/chartex" xmlns:cx1="http://schemas.microsoft.com/office/drawing/2015/9/8/chartex" xmlns:cx2="http://schemas.microsoft.com/office/drawing/2015/10/21/chartex" xmlns:cx3="http://schemas.microsoft.com/office/drawing/2016/5/9/chartex" xmlns:cx4="http://schemas.microsoft.com/office/drawing/2016/5/10/chartex" xmlns:cx5="http://schemas.microsoft.com/office/drawing/2016/5/11/chartex" xmlns:cx6="http://schemas.microsoft.com/office/drawing/2016/5/12/chartex" xmlns:cx7="http://schemas.microsoft.com/office/drawing/2016/5/13/chartex" xmlns:cx8="http://schemas.microsoft.com/office/drawing/2016/5/14/chartex" xmlns:mc="http://schemas.openxmlformats.org/markup-compatibility/2006" xmlns:aink="http://schemas.microsoft.com/office/drawing/2016/ink" xmlns:am3d="http://schemas.microsoft.com/office/drawing/2017/model3d" xmlns:o="urn:schemas-microsoft-com:office:office" xmlns:oel="http://schemas.microsoft.com/office/2019/extlst" xmlns:r="http://schemas.openxmlformats.org/officeDocument/2006/relationships" xmlns:m="http://schemas.openxmlformats.org/officeDocument/2006/math" xmlns:v="urn:schemas-microsoft-com:vml" xmlns:wp14="http://schemas.microsoft.com/office/word/2010/wordprocessingDrawing" xmlns:wp="http://schemas.openxmlformats.org/drawingml/2006/wordprocessingDrawing" xmlns:w10="urn:schemas-microsoft-com:office:word" xmlns:w="http://schemas.openxmlformats.org/wordprocessingml/2006/main" xmlns:w14="http://schemas.microsoft.com/office/word/2010/wordml" xmlns:w15="http://schemas.microsoft.com/office/word/2012/wordml" xmlns:w16cex="http://schemas.microsoft.com/office/word/2018/wordml/cex" xmlns:w16cid="http://schemas.microsoft.com/office/word/2016/wordml/cid" xmlns:w16="http://schemas.microsoft.com/office/word/2018/wordml" xmlns:w16du="http://schemas.microsoft.com/office/word/2023/wordml/word16du" xmlns:w16sdtdh="http://schemas.microsoft.com/office/word/2020/wordml/sdtdatahash" xmlns:w16sdtfl="http://schemas.microsoft.com/office/word/2024/wordml/sdtformatlock" xmlns:w16se="http://schemas.microsoft.com/office/word/2015/wordml/symex" xmlns:wpg="http://schemas.microsoft.com/office/word/2010/wordprocessingGroup" xmlns:wpi="http://schemas.microsoft.com/office/word/2010/wordprocessingInk" xmlns:wne="http://schemas.microsoft.com/office/word/2006/wordml" xmlns:wps="http://schemas.microsoft.com/office/word/2010/wordprocessingShape" mc:Ignorable="w14 w15 w16se w16cid w16 w16cex w16sdtdh w16sdtfl w16du wp14">
   <w:body>
     <w:p/>
+    <w:p>
+      <w:pPr>
+        <w:jc w:val="center"/>
+      </w:pPr>
+      <w:r>
+        <w:drawing>
+          <wp:inline xmlns:a="http://schemas.openxmlformats.org/drawingml/2006/main" xmlns:pic="http://schemas.openxmlformats.org/drawingml/2006/picture">
+            <wp:extent cx="1005840" cy="1005840"/>
+            <wp:docPr id="20" name="Picture 20"/>
+            <wp:cNvGraphicFramePr>
+              <a:graphicFrameLocks noChangeAspect="1"/>
+            </wp:cNvGraphicFramePr>
+            <a:graphic>
+              <a:graphicData uri="http://schemas.openxmlformats.org/drawingml/2006/picture">
+                <pic:pic>
+                  <pic:nvPicPr>
+                    <pic:cNvPr id="0" name="hobyd logo favicon.png"/>
+                    <pic:cNvPicPr/>
+                  </pic:nvPicPr>
+                  <pic:blipFill>
+                    <a:blip r:embed="rId27"/>
+                    <a:stretch>
+                      <a:fillRect/>
+                    </a:stretch>
+                  </pic:blipFill>
+                  <pic:spPr>
+                    <a:xfrm>
+                      <a:off x="0" y="0"/>
+                      <a:ext cx="1005840" cy="1005840"/>
+                    </a:xfrm>
+                    <a:prstGeom prst="rect"/>
+                  </pic:spPr>
+                </pic:pic>
+              </a:graphicData>
+            </a:graphic>
+          </wp:inline>
+        </w:drawing>
+      </w:r>
+    </w:p>
     <w:p>
       <w:pPr>
         <w:jc w:val="center"/>

</xml_diff>